<commit_message>
Regenerate the defense cheatsheet from the shared content module
</commit_message>
<xml_diff>
--- a/documents/ensights-defense-cheatsheet.docx
+++ b/documents/ensights-defense-cheatsheet.docx
@@ -125,7 +125,7 @@
           <w:color w:val="241F1B"/>
           <w:sz w:val="22"/>
         </w:rPr>
-        <w:t>Καλησπέρα σας. Λέγομαι Χρήστος Μουρτογιάννης και θα σας παρουσιάσω τη διπλωματική μου εργασία, με θέμα την εξαγωγή αναλύσεων από δεδομένα ηλεκτρονικού εμπορίου. Επιβλέπων είναι ο καθηγητής Ευστάθιος Χατζηευθυμιάδης.</w:t>
+        <w:t>Καλησπέρα σας. Ονομάζομαι Μουρτογιάννης Χρήστος και θα σας παρουσιάσω τη διπλωματική μου εργασία, με θέμα: Εξαγωγή Ευφυών Αναλύσεων από Δεδομένα Ηλεκτρονικού Εμπορίου.</w:t>
       </w:r>
     </w:p>
     <w:p>
@@ -139,7 +139,7 @@
           <w:color w:val="241F1B"/>
           <w:sz w:val="26"/>
         </w:rPr>
-        <w:t>Διαφάνεια 2: Τέσσερα μέρη, περίπου είκοσι πέντε λεπτά</w:t>
+        <w:t>Διαφάνεια 2: Τέσσερα μέρη</w:t>
       </w:r>
     </w:p>
     <w:p>
@@ -223,7 +223,7 @@
           <w:color w:val="241F1B"/>
           <w:sz w:val="22"/>
         </w:rPr>
-        <w:t>Πρώτο μέρος: το πρόβλημα και οι στόχοι.</w:t>
+        <w:t>Πρώτο μέρος: Το πρόβλημα.</w:t>
       </w:r>
     </w:p>
     <w:p>
@@ -237,7 +237,7 @@
           <w:color w:val="241F1B"/>
           <w:sz w:val="26"/>
         </w:rPr>
-        <w:t>Διαφάνεια 4: Τα δεδομένα υπάρχουν, οι αποφάσεις δεν τα κοιτάνε</w:t>
+        <w:t>Διαφάνεια 4: Αξιοποίηση των δεδομένων</w:t>
       </w:r>
     </w:p>
     <w:p>
@@ -307,7 +307,7 @@
           <w:color w:val="241F1B"/>
           <w:sz w:val="26"/>
         </w:rPr>
-        <w:t>Διαφάνεια 5: Επτά ερωτήματα που κάνει κάθε κατάστημα</w:t>
+        <w:t>Διαφάνεια 5: 7 ερωτήματα που καλούνται να απαντήσουν οι επιχειρήσεις</w:t>
       </w:r>
     </w:p>
     <w:p>
@@ -377,7 +377,7 @@
           <w:color w:val="241F1B"/>
           <w:sz w:val="26"/>
         </w:rPr>
-        <w:t>Διαφάνεια 6: Δύο κανόνες που τηρούνται παντού</w:t>
+        <w:t>Διαφάνεια 6: Δύο κανόνες</w:t>
       </w:r>
     </w:p>
     <w:p>
@@ -405,7 +405,7 @@
           <w:color w:val="241F1B"/>
           <w:sz w:val="22"/>
         </w:rPr>
-        <w:t>Δύο κανόνες διατρέχουν όλη τη δουλειά. Ο πρώτος: δουλεύει παντού. Το σύστημα δεν είναι φτιαγμένο για το συγκεκριμένο μαγαζί. Ο δεύτερος: δεν λέει ψέματα. Αν κάτι δεν μπορεί να μετρηθεί, δεν προσποιούμαστε ότι το ξέρουμε.</w:t>
+        <w:t>Δύο κανόνες διατρέχουν όλη τη δουλειά. Ο πρώτος: η καθολικότητα. Το σύστημα δεν είναι φτιαγμένο για το συγκεκριμένο μαγαζί. Ο δεύτερος: η απόλυτη ειλικρίνεια. Αν κάτι δεν μπορεί να μετρηθεί, δεν προσποιούμαστε ότι το ξέρουμε.</w:t>
       </w:r>
     </w:p>
     <w:p>
@@ -489,7 +489,7 @@
           <w:color w:val="241F1B"/>
           <w:sz w:val="22"/>
         </w:rPr>
-        <w:t>Δεύτερο μέρος: το σύστημα, πώς είναι φτιαγμένο και πώς τρέχει.</w:t>
+        <w:t>Δεύτερο μέρος: Το σύστημα.</w:t>
       </w:r>
     </w:p>
     <w:p>
@@ -503,7 +503,7 @@
           <w:color w:val="241F1B"/>
           <w:sz w:val="26"/>
         </w:rPr>
-        <w:t>Διαφάνεια 8: Τέσσερα επίπεδα, τρεις έξοδοι</w:t>
+        <w:t>Διαφάνεια 8: Interfaces και outputs</w:t>
       </w:r>
     </w:p>
     <w:p>
@@ -573,7 +573,7 @@
           <w:color w:val="241F1B"/>
           <w:sz w:val="26"/>
         </w:rPr>
-        <w:t>Διαφάνεια 9: Τρεις δρόμοι για τα δεδομένα, ένας μόνο θέλει κώδικα</w:t>
+        <w:t>Διαφάνεια 9: Τρόποι εισαγωγής δεδομένων</w:t>
       </w:r>
     </w:p>
     <w:p>
@@ -671,7 +671,7 @@
           <w:color w:val="241F1B"/>
           <w:sz w:val="26"/>
         </w:rPr>
-        <w:t>Διαφάνεια 10: Το API, με πραγματικές απαντήσεις</w:t>
+        <w:t>Διαφάνεια 10: API Responses</w:t>
       </w:r>
     </w:p>
     <w:p>
@@ -741,7 +741,7 @@
           <w:color w:val="241F1B"/>
           <w:sz w:val="26"/>
         </w:rPr>
-        <w:t>Διαφάνεια 11: Τα ίδια νούμερα, χωρίς μία γραμμή κώδικα</w:t>
+        <w:t>Διαφάνεια 11: Metabase</w:t>
       </w:r>
     </w:p>
     <w:p>
@@ -881,7 +881,7 @@
           <w:color w:val="241F1B"/>
           <w:sz w:val="22"/>
         </w:rPr>
-        <w:t>Τρίτο μέρος: τι βρήκαμε μέσα στα δεδομένα.</w:t>
+        <w:t>Τρίτο μέρος: Τα ευρήματα.</w:t>
       </w:r>
     </w:p>
     <w:p>
@@ -1133,7 +1133,7 @@
           <w:color w:val="241F1B"/>
           <w:sz w:val="22"/>
         </w:rPr>
-        <w:t>Παράδειγμα με δέκα αποδείξεις, όπου οι τρεις έχουν ψωμί και βούτυρο μαζί. Support ίσον τρία δέκατα, δηλαδή 0,3. Αν το ψωμί υπάρχει σε πέντε αποδείξεις, το confidence είναι τρία πέμπτα, δηλαδή 0,6. Τώρα το κρίσιμο. Αν το βούτυρο είναι ούτως ή άλλως δημοφιλές, με support 0,8, τότε το lift είναι 0,6 διά 0,8, ίσον 0,75, κάτω από ένα, καμία πραγματική σχέση. Αν το βούτυρο είναι σπάνιο, με support 0,2, τότε το lift είναι 3, τριπλάσια πιθανότητα από την τύχη. Οι τύποι είναι στις εφεδρικές διαφάνειες.</w:t>
+        <w:t>Παράδειγμα με δέκα καλάθια, όπου τα τρία έχουν κινητό και φορτιστή μαζί. Support ίσον τρία δέκατα, δηλαδή 0,3. Αν ο φορτιστής είναι σπάνιο προϊόν από μόνος του, το lift εκτοξεύεται στο 3, τριπλάσια πιθανότητα αγοράς από την τύχη. Αν αντίθετα ο φορτιστής είναι ούτως ή άλλως δημοφιλής, το lift πέφτει κάτω από 1 και δεν υπάρχει πραγματική σχέση. Οι τύποι είναι στις εφεδρικές διαφάνειες.</w:t>
       </w:r>
     </w:p>
     <w:p>
@@ -1175,7 +1175,7 @@
           <w:color w:val="241F1B"/>
           <w:sz w:val="26"/>
         </w:rPr>
-        <w:t>Διαφάνεια 17: Ίδιο αποτέλεσμα, 2,6 φορές πιο γρήγορα</w:t>
+        <w:t>Διαφάνεια 17: Apriori vs FP-Growth</w:t>
       </w:r>
     </w:p>
     <w:p>
@@ -1245,7 +1245,7 @@
           <w:color w:val="241F1B"/>
           <w:sz w:val="26"/>
         </w:rPr>
-        <w:t>Διαφάνεια 18: Ο πιο δυνατός κανόνας: lift 25,2</w:t>
+        <w:t>Διαφάνεια 18: Lift</w:t>
       </w:r>
     </w:p>
     <w:p>
@@ -1413,7 +1413,7 @@
           <w:color w:val="241F1B"/>
           <w:sz w:val="26"/>
         </w:rPr>
-        <w:t>Διαφάνεια 20: Το Ηνωμένο Βασίλειο βγαίνει μόνο του</w:t>
+        <w:t>Διαφάνεια 20: Ομαδοποίηση περιοχών και πελατών</w:t>
       </w:r>
     </w:p>
     <w:p>
@@ -1483,7 +1483,7 @@
           <w:color w:val="241F1B"/>
           <w:sz w:val="26"/>
         </w:rPr>
-        <w:t>Διαφάνεια 21: Ο μήνας ήταν κομμένος, όχι πεσμένος</w:t>
+        <w:t>Διαφάνεια 21: Skill score και περίοδος προβλέψεων</w:t>
       </w:r>
     </w:p>
     <w:p>
@@ -1651,7 +1651,7 @@
           <w:color w:val="241F1B"/>
           <w:sz w:val="26"/>
         </w:rPr>
-        <w:t>Διαφάνεια 23: Κερδοφορία: σενάριο, όχι μέτρηση</w:t>
+        <w:t>Διαφάνεια 23: Κερδοφορία</w:t>
       </w:r>
     </w:p>
     <w:p>
@@ -1791,7 +1791,7 @@
           <w:color w:val="241F1B"/>
           <w:sz w:val="22"/>
         </w:rPr>
-        <w:t>Τέταρτο μέρος: συμπεράσματα, περιορισμοί και επεκτάσεις.</w:t>
+        <w:t>Τέταρτο μέρος: Συμπεράσματα.</w:t>
       </w:r>
     </w:p>
     <w:p>
@@ -1805,7 +1805,7 @@
           <w:color w:val="241F1B"/>
           <w:sz w:val="26"/>
         </w:rPr>
-        <w:t>Διαφάνεια 25: Τι απαντήθηκε και τι κάνει κανείς με αυτό</w:t>
+        <w:t>Διαφάνεια 25: Τι απαντήθηκε και τι προσφέρει στην επιχείρηση</w:t>
       </w:r>
     </w:p>
     <w:p>
@@ -1875,7 +1875,7 @@
           <w:color w:val="241F1B"/>
           <w:sz w:val="26"/>
         </w:rPr>
-        <w:t>Διαφάνεια 26: Πού σταματάμε και τι θα ερχόταν μετά</w:t>
+        <w:t>Διαφάνεια 26: Επίλογος και ερωτήσεις</w:t>
       </w:r>
     </w:p>
     <w:p>
@@ -1903,77 +1903,7 @@
           <w:color w:val="241F1B"/>
           <w:sz w:val="22"/>
         </w:rPr>
-        <w:t>Αριστερά τα πέντε πράγματα που η δουλειά δεν μπορεί να κάνει, δηλωμένα ανοιχτά. Το πιο σημαντικό είναι το πρώτο: δεν ξέρουμε τα κόστη, οπότε δεν μπορούμε να πούμε με σιγουριά αν το μαγαζί είναι κερδοφόρο.</w:t>
-      </w:r>
-    </w:p>
-    <w:p>
-      <w:pPr>
-        <w:spacing w:before="120" w:after="40"/>
-      </w:pPr>
-      <w:r>
-        <w:rPr>
-          <w:rFonts w:ascii="Calibri" w:hAnsi="Calibri"/>
-          <w:b/>
-          <w:color w:val="C1822A"/>
-          <w:sz w:val="18"/>
-        </w:rPr>
-        <w:t>ΤΑ ΜΑΘΗΜΑΤΙΚΑ, Ή ΠΩΣ ΔΟΥΛΕΥΕΙ</w:t>
-      </w:r>
-    </w:p>
-    <w:p>
-      <w:pPr>
-        <w:spacing w:before="0" w:after="120"/>
-      </w:pPr>
-      <w:r>
-        <w:rPr>
-          <w:rFonts w:ascii="Calibri" w:hAnsi="Calibri"/>
-          <w:b w:val="0"/>
-          <w:color w:val="241F1B"/>
-          <w:sz w:val="22"/>
-        </w:rPr>
-        <w:t>Δεξιά, πέντε ιδέες για τη συνέχεια. Η πιο άμεση είναι το δεύτερο κατάστημα: η προσθήκη του είναι πλέον απλή παραμετροποίηση, εκκρεμεί μόνο η σύγκριση των ευρημάτων. Η τελευταία, τα πραγματικά κόστη, θα μετέτρεπε τα σενάρια κερδοφορίας σε μετρήσεις, και η αρχιτεκτονική το επιτρέπει χωρίς αλλαγή δομής.</w:t>
-      </w:r>
-    </w:p>
-    <w:p>
-      <w:pPr>
-        <w:spacing w:before="280" w:after="80"/>
-      </w:pPr>
-      <w:r>
-        <w:rPr>
-          <w:rFonts w:ascii="Cambria" w:hAnsi="Cambria"/>
-          <w:b/>
-          <w:color w:val="241F1B"/>
-          <w:sz w:val="26"/>
-        </w:rPr>
-        <w:t>Διαφάνεια 27: Επίλογος και ερωτήσεις</w:t>
-      </w:r>
-    </w:p>
-    <w:p>
-      <w:pPr>
-        <w:spacing w:before="0" w:after="40"/>
-      </w:pPr>
-      <w:r>
-        <w:rPr>
-          <w:rFonts w:ascii="Calibri" w:hAnsi="Calibri"/>
-          <w:b/>
-          <w:color w:val="C1822A"/>
-          <w:sz w:val="18"/>
-        </w:rPr>
-        <w:t>ΜΕ ΑΠΛΑ ΛΟΓΙΑ</w:t>
-      </w:r>
-    </w:p>
-    <w:p>
-      <w:pPr>
-        <w:spacing w:before="0" w:after="120"/>
-      </w:pPr>
-      <w:r>
-        <w:rPr>
-          <w:rFonts w:ascii="Calibri" w:hAnsi="Calibri"/>
-          <w:b w:val="0"/>
-          <w:color w:val="241F1B"/>
-          <w:sz w:val="22"/>
-        </w:rPr>
-        <w:t>Το μήνυμα όλης της δουλειάς σε μία πρόταση: να απαντηθεί ό,τι ζήτησε η επιχείρηση, και να μην προσποιηθούμε ότι απαντάμε σε πράγματα που τα δεδομένα δεν επιτρέπουν. Ευχαριστώ πολύ.</w:t>
+        <w:t>Το μήνυμα όλης της δουλειάς σε μία πρόταση: να απαντηθεί ό,τι ζητάει μια επιχείρηση, και να μην απαντηθεί ό,τι τα δεδομένα δεν επιτρέπουν. Σας ευχαριστώ πολύ για τον χρόνο σας και την προσοχή σας.</w:t>
       </w:r>
     </w:p>
     <w:p>
@@ -2808,7 +2738,7 @@
                 <w:b w:val="0"/>
                 <w:sz w:val="20"/>
               </w:rPr>
-              <w:t>Το εύρος 1 ως 5 λίρες φέρνει το 62% των εσόδων</w:t>
+              <w:t>Το εύρος 1 ως 5 λίρες φέρνει το 64% των εσόδων</w:t>
             </w:r>
           </w:p>
         </w:tc>

</xml_diff>

<commit_message>
Regenerate the defense cheatsheet without the backup slides
</commit_message>
<xml_diff>
--- a/documents/ensights-defense-cheatsheet.docx
+++ b/documents/ensights-defense-cheatsheet.docx
@@ -1133,7 +1133,7 @@
           <w:color w:val="241F1B"/>
           <w:sz w:val="22"/>
         </w:rPr>
-        <w:t>Παράδειγμα με δέκα καλάθια, όπου τα τρία έχουν κινητό και φορτιστή μαζί. Support ίσον τρία δέκατα, δηλαδή 0,3. Αν ο φορτιστής είναι σπάνιο προϊόν από μόνος του, το lift εκτοξεύεται στο 3, τριπλάσια πιθανότητα αγοράς από την τύχη. Αν αντίθετα ο φορτιστής είναι ούτως ή άλλως δημοφιλής, το lift πέφτει κάτω από 1 και δεν υπάρχει πραγματική σχέση. Οι τύποι είναι στις εφεδρικές διαφάνειες.</w:t>
+        <w:t>Παράδειγμα με δέκα καλάθια, όπου τα τρία έχουν κινητό και φορτιστή μαζί. Support ίσον τρία δέκατα, δηλαδή 0,3. Αν ο φορτιστής είναι σπάνιο προϊόν από μόνος του, το lift εκτοξεύεται στο 3, τριπλάσια πιθανότητα αγοράς από την τύχη. Αν αντίθετα ο φορτιστής είναι ούτως ή άλλως δημοφιλής, το lift πέφτει κάτω από 1 και δεν υπάρχει πραγματική σχέση.</w:t>
       </w:r>
     </w:p>
     <w:p>
@@ -1371,7 +1371,7 @@
           <w:color w:val="241F1B"/>
           <w:sz w:val="22"/>
         </w:rPr>
-        <w:t>Το silhouette συγκρίνει πόσο κοντά είναι κάθε σημείο στη δική του ομάδα σε σχέση με την πιο κοντινή άλλη. Κοντά στο συν ένα είναι καλό, στο μηδέν μπερδεμένο, στο μείον ένα λάθος ομάδα. Δοκιμάζουμε πολλά k και κρατάμε το καλύτερο μέσο σκορ. Οι τύποι είναι στις εφεδρικές διαφάνειες.</w:t>
+        <w:t>Το silhouette συγκρίνει πόσο κοντά είναι κάθε σημείο στη δική του ομάδα σε σχέση με την πιο κοντινή άλλη. Κοντά στο συν ένα είναι καλό, στο μηδέν μπερδεμένο, στο μείον ένα λάθος ομάδα. Δοκιμάζουμε πολλά k και κρατάμε το καλύτερο μέσο σκορ.</w:t>
       </w:r>
     </w:p>
     <w:p>
@@ -1904,230 +1904,6 @@
           <w:sz w:val="22"/>
         </w:rPr>
         <w:t>Το μήνυμα όλης της δουλειάς σε μία πρόταση: να απαντηθεί ό,τι ζητάει μια επιχείρηση, και να μην απαντηθεί ό,τι τα δεδομένα δεν επιτρέπουν. Σας ευχαριστώ πολύ για τον χρόνο σας και την προσοχή σας.</w:t>
-      </w:r>
-    </w:p>
-    <w:p>
-      <w:pPr>
-        <w:spacing w:before="400" w:after="200"/>
-      </w:pPr>
-      <w:r>
-        <w:rPr>
-          <w:rFonts w:ascii="Cambria" w:hAnsi="Cambria"/>
-          <w:b/>
-          <w:color w:val="2C5530"/>
-          <w:sz w:val="30"/>
-        </w:rPr>
-        <w:t>Εφεδρικές διαφάνειες, μετά το ευχαριστώ</w:t>
-      </w:r>
-    </w:p>
-    <w:p>
-      <w:pPr>
-        <w:spacing w:before="280" w:after="80"/>
-      </w:pPr>
-      <w:r>
-        <w:rPr>
-          <w:rFonts w:ascii="Cambria" w:hAnsi="Cambria"/>
-          <w:b/>
-          <w:color w:val="241F1B"/>
-          <w:sz w:val="26"/>
-        </w:rPr>
-        <w:t>Διαφάνεια B1: Οι τύποι της εξόρυξης συχνών συνόλων</w:t>
-      </w:r>
-    </w:p>
-    <w:p>
-      <w:pPr>
-        <w:spacing w:before="0" w:after="40"/>
-      </w:pPr>
-      <w:r>
-        <w:rPr>
-          <w:rFonts w:ascii="Calibri" w:hAnsi="Calibri"/>
-          <w:b/>
-          <w:color w:val="C1822A"/>
-          <w:sz w:val="18"/>
-        </w:rPr>
-        <w:t>ΜΕ ΑΠΛΑ ΛΟΓΙΑ</w:t>
-      </w:r>
-    </w:p>
-    <w:p>
-      <w:pPr>
-        <w:spacing w:before="0" w:after="120"/>
-      </w:pPr>
-      <w:r>
-        <w:rPr>
-          <w:rFonts w:ascii="Calibri" w:hAnsi="Calibri"/>
-          <w:b w:val="0"/>
-          <w:color w:val="241F1B"/>
-          <w:sz w:val="22"/>
-        </w:rPr>
-        <w:t>Εφεδρική διαφάνεια με τους τύπους, αν η επιτροπή τους ζητήσει.</w:t>
-      </w:r>
-    </w:p>
-    <w:p>
-      <w:pPr>
-        <w:spacing w:before="280" w:after="80"/>
-      </w:pPr>
-      <w:r>
-        <w:rPr>
-          <w:rFonts w:ascii="Cambria" w:hAnsi="Cambria"/>
-          <w:b/>
-          <w:color w:val="241F1B"/>
-          <w:sz w:val="26"/>
-        </w:rPr>
-        <w:t>Διαφάνεια B2: Οι τύποι της ομαδοποίησης</w:t>
-      </w:r>
-    </w:p>
-    <w:p>
-      <w:pPr>
-        <w:spacing w:before="0" w:after="40"/>
-      </w:pPr>
-      <w:r>
-        <w:rPr>
-          <w:rFonts w:ascii="Calibri" w:hAnsi="Calibri"/>
-          <w:b/>
-          <w:color w:val="C1822A"/>
-          <w:sz w:val="18"/>
-        </w:rPr>
-        <w:t>ΜΕ ΑΠΛΑ ΛΟΓΙΑ</w:t>
-      </w:r>
-    </w:p>
-    <w:p>
-      <w:pPr>
-        <w:spacing w:before="0" w:after="120"/>
-      </w:pPr>
-      <w:r>
-        <w:rPr>
-          <w:rFonts w:ascii="Calibri" w:hAnsi="Calibri"/>
-          <w:b w:val="0"/>
-          <w:color w:val="241F1B"/>
-          <w:sz w:val="22"/>
-        </w:rPr>
-        <w:t>Εφεδρική διαφάνεια με τους τύπους της ομαδοποίησης.</w:t>
-      </w:r>
-    </w:p>
-    <w:p>
-      <w:pPr>
-        <w:spacing w:before="280" w:after="80"/>
-      </w:pPr>
-      <w:r>
-        <w:rPr>
-          <w:rFonts w:ascii="Cambria" w:hAnsi="Cambria"/>
-          <w:b/>
-          <w:color w:val="241F1B"/>
-          <w:sz w:val="26"/>
-        </w:rPr>
-        <w:t>Διαφάνεια B3: Το πλήρες πλέγμα LTV προς CAC</w:t>
-      </w:r>
-    </w:p>
-    <w:p>
-      <w:pPr>
-        <w:spacing w:before="0" w:after="40"/>
-      </w:pPr>
-      <w:r>
-        <w:rPr>
-          <w:rFonts w:ascii="Calibri" w:hAnsi="Calibri"/>
-          <w:b/>
-          <w:color w:val="C1822A"/>
-          <w:sz w:val="18"/>
-        </w:rPr>
-        <w:t>ΜΕ ΑΠΛΑ ΛΟΓΙΑ</w:t>
-      </w:r>
-    </w:p>
-    <w:p>
-      <w:pPr>
-        <w:spacing w:before="0" w:after="120"/>
-      </w:pPr>
-      <w:r>
-        <w:rPr>
-          <w:rFonts w:ascii="Calibri" w:hAnsi="Calibri"/>
-          <w:b w:val="0"/>
-          <w:color w:val="241F1B"/>
-          <w:sz w:val="22"/>
-        </w:rPr>
-        <w:t>Εφεδρική διαφάνεια με το πλήρες πλέγμα κερδοφορίας.</w:t>
-      </w:r>
-    </w:p>
-    <w:p>
-      <w:pPr>
-        <w:spacing w:before="280" w:after="80"/>
-      </w:pPr>
-      <w:r>
-        <w:rPr>
-          <w:rFonts w:ascii="Cambria" w:hAnsi="Cambria"/>
-          <w:b/>
-          <w:color w:val="241F1B"/>
-          <w:sz w:val="26"/>
-        </w:rPr>
-        <w:t>Διαφάνεια B4: Ευαισθησία στο κατώφλι support</w:t>
-      </w:r>
-    </w:p>
-    <w:p>
-      <w:pPr>
-        <w:spacing w:before="0" w:after="40"/>
-      </w:pPr>
-      <w:r>
-        <w:rPr>
-          <w:rFonts w:ascii="Calibri" w:hAnsi="Calibri"/>
-          <w:b/>
-          <w:color w:val="C1822A"/>
-          <w:sz w:val="18"/>
-        </w:rPr>
-        <w:t>ΜΕ ΑΠΛΑ ΛΟΓΙΑ</w:t>
-      </w:r>
-    </w:p>
-    <w:p>
-      <w:pPr>
-        <w:spacing w:before="0" w:after="120"/>
-      </w:pPr>
-      <w:r>
-        <w:rPr>
-          <w:rFonts w:ascii="Calibri" w:hAnsi="Calibri"/>
-          <w:b w:val="0"/>
-          <w:color w:val="241F1B"/>
-          <w:sz w:val="22"/>
-        </w:rPr>
-        <w:t>Εφεδρική διαφάνεια με την ευαισθησία στο κατώφλι.</w:t>
-      </w:r>
-    </w:p>
-    <w:p>
-      <w:pPr>
-        <w:spacing w:before="280" w:after="80"/>
-      </w:pPr>
-      <w:r>
-        <w:rPr>
-          <w:rFonts w:ascii="Cambria" w:hAnsi="Cambria"/>
-          <w:b/>
-          <w:color w:val="241F1B"/>
-          <w:sz w:val="26"/>
-        </w:rPr>
-        <w:t>Διαφάνεια B5: Δύο ακόμα κατανομές</w:t>
-      </w:r>
-    </w:p>
-    <w:p>
-      <w:pPr>
-        <w:spacing w:before="0" w:after="40"/>
-      </w:pPr>
-      <w:r>
-        <w:rPr>
-          <w:rFonts w:ascii="Calibri" w:hAnsi="Calibri"/>
-          <w:b/>
-          <w:color w:val="C1822A"/>
-          <w:sz w:val="18"/>
-        </w:rPr>
-        <w:t>ΜΕ ΑΠΛΑ ΛΟΓΙΑ</w:t>
-      </w:r>
-    </w:p>
-    <w:p>
-      <w:pPr>
-        <w:spacing w:before="0" w:after="120"/>
-      </w:pPr>
-      <w:r>
-        <w:rPr>
-          <w:rFonts w:ascii="Calibri" w:hAnsi="Calibri"/>
-          <w:b w:val="0"/>
-          <w:color w:val="241F1B"/>
-          <w:sz w:val="22"/>
-        </w:rPr>
-        <w:t>Εφεδρική διαφάνεια με τα δύο γραφήματα που βγήκαν από τη ροή.</w:t>
       </w:r>
     </w:p>
     <w:p>

</xml_diff>